<commit_message>
Phase 129: History backend — TinyDB store with atomic writes and corrupt-file recovery, /api/history CRUD with search/filter/sort/pagination, auto-save of successful predictions, Insights aggregates; F16 draws the History store apart from the computing routes
Co-Authored-By: Claude Opus 5 <noreply@anthropic.com>
</commit_message>
<xml_diff>
--- a/outputs/THESIS_ASSETS/Ch4_Implementation/reproducibility_appendix.docx
+++ b/outputs/THESIS_ASSETS/Ch4_Implementation/reproducibility_appendix.docx
@@ -218,7 +218,7 @@
               <w:rPr>
                 <w:sz w:val="14"/>
               </w:rPr>
-              <w:t>97738638c956f80eb1bffa4279496593476b3f5a</w:t>
+              <w:t>1ef602a52db1de7024b48d1a85be2f0c49f6d354</w:t>
             </w:r>
           </w:p>
         </w:tc>
@@ -246,7 +246,7 @@
               <w:rPr>
                 <w:sz w:val="14"/>
               </w:rPr>
-              <w:t>2026-09-11T14:54:48.373992+00:00</w:t>
+              <w:t>2026-09-13T17:10:24.652302+00:00</w:t>
             </w:r>
           </w:p>
         </w:tc>
@@ -262,7 +262,7 @@
     </w:p>
     <w:p>
       <w:r>
-        <w:t>Global seed: 42. Runs by recorded seed: 42 -&gt; 284. Runs recording a different seed: none.</w:t>
+        <w:t>Global seed: 42. Runs by recorded seed: 42 -&gt; 354. Runs recording a different seed: none.</w:t>
       </w:r>
     </w:p>
     <w:p>
@@ -2971,46 +2971,46 @@
               <w:rPr>
                 <w:sz w:val="14"/>
               </w:rPr>
-              <w:t>5</w:t>
-            </w:r>
-          </w:p>
-        </w:tc>
-        <w:tc>
-          <w:tcPr>
-            <w:tcW w:type="dxa" w:w="1234"/>
-          </w:tcPr>
-          <w:p>
-            <w:r>
-              <w:rPr>
-                <w:sz w:val="14"/>
-              </w:rPr>
-              <w:t>5</w:t>
-            </w:r>
-          </w:p>
-        </w:tc>
-        <w:tc>
-          <w:tcPr>
-            <w:tcW w:type="dxa" w:w="1234"/>
-          </w:tcPr>
-          <w:p>
-            <w:r>
-              <w:rPr>
-                <w:sz w:val="14"/>
-              </w:rPr>
-              <w:t>0</w:t>
-            </w:r>
-          </w:p>
-        </w:tc>
-        <w:tc>
-          <w:tcPr>
-            <w:tcW w:type="dxa" w:w="1234"/>
-          </w:tcPr>
-          <w:p>
-            <w:r>
-              <w:rPr>
-                <w:sz w:val="14"/>
-              </w:rPr>
-              <w:t>2409.0</w:t>
+              <w:t>7</w:t>
+            </w:r>
+          </w:p>
+        </w:tc>
+        <w:tc>
+          <w:tcPr>
+            <w:tcW w:type="dxa" w:w="1234"/>
+          </w:tcPr>
+          <w:p>
+            <w:r>
+              <w:rPr>
+                <w:sz w:val="14"/>
+              </w:rPr>
+              <w:t>6</w:t>
+            </w:r>
+          </w:p>
+        </w:tc>
+        <w:tc>
+          <w:tcPr>
+            <w:tcW w:type="dxa" w:w="1234"/>
+          </w:tcPr>
+          <w:p>
+            <w:r>
+              <w:rPr>
+                <w:sz w:val="14"/>
+              </w:rPr>
+              <w:t>1</w:t>
+            </w:r>
+          </w:p>
+        </w:tc>
+        <w:tc>
+          <w:tcPr>
+            <w:tcW w:type="dxa" w:w="1234"/>
+          </w:tcPr>
+          <w:p>
+            <w:r>
+              <w:rPr>
+                <w:sz w:val="14"/>
+              </w:rPr>
+              <w:t>2821.9</w:t>
             </w:r>
           </w:p>
         </w:tc>
@@ -3715,20 +3715,20 @@
               <w:rPr>
                 <w:sz w:val="14"/>
               </w:rPr>
-              <w:t>56</w:t>
-            </w:r>
-          </w:p>
-        </w:tc>
-        <w:tc>
-          <w:tcPr>
-            <w:tcW w:type="dxa" w:w="1234"/>
-          </w:tcPr>
-          <w:p>
-            <w:r>
-              <w:rPr>
-                <w:sz w:val="14"/>
-              </w:rPr>
-              <w:t>50</w:t>
+              <w:t>94</w:t>
+            </w:r>
+          </w:p>
+        </w:tc>
+        <w:tc>
+          <w:tcPr>
+            <w:tcW w:type="dxa" w:w="1234"/>
+          </w:tcPr>
+          <w:p>
+            <w:r>
+              <w:rPr>
+                <w:sz w:val="14"/>
+              </w:rPr>
+              <w:t>88</w:t>
             </w:r>
           </w:p>
         </w:tc>
@@ -3754,20 +3754,20 @@
               <w:rPr>
                 <w:sz w:val="14"/>
               </w:rPr>
-              <w:t>465.2</w:t>
-            </w:r>
-          </w:p>
-        </w:tc>
-        <w:tc>
-          <w:tcPr>
-            <w:tcW w:type="dxa" w:w="1234"/>
-          </w:tcPr>
-          <w:p>
-            <w:r>
-              <w:rPr>
-                <w:sz w:val="14"/>
-              </w:rPr>
-              <w:t>35.3</w:t>
+              <w:t>1058.8</w:t>
+            </w:r>
+          </w:p>
+        </w:tc>
+        <w:tc>
+          <w:tcPr>
+            <w:tcW w:type="dxa" w:w="1234"/>
+          </w:tcPr>
+          <w:p>
+            <w:r>
+              <w:rPr>
+                <w:sz w:val="14"/>
+              </w:rPr>
+              <w:t>49.1</w:t>
             </w:r>
           </w:p>
         </w:tc>
@@ -3808,6 +3808,19 @@
               <w:rPr>
                 <w:sz w:val="14"/>
               </w:rPr>
+              <w:t>4</w:t>
+            </w:r>
+          </w:p>
+        </w:tc>
+        <w:tc>
+          <w:tcPr>
+            <w:tcW w:type="dxa" w:w="1234"/>
+          </w:tcPr>
+          <w:p>
+            <w:r>
+              <w:rPr>
+                <w:sz w:val="14"/>
+              </w:rPr>
               <w:t>3</w:t>
             </w:r>
           </w:p>
@@ -3821,19 +3834,6 @@
               <w:rPr>
                 <w:sz w:val="14"/>
               </w:rPr>
-              <w:t>2</w:t>
-            </w:r>
-          </w:p>
-        </w:tc>
-        <w:tc>
-          <w:tcPr>
-            <w:tcW w:type="dxa" w:w="1234"/>
-          </w:tcPr>
-          <w:p>
-            <w:r>
-              <w:rPr>
-                <w:sz w:val="14"/>
-              </w:rPr>
               <w:t>1</w:t>
             </w:r>
           </w:p>
@@ -3847,20 +3847,20 @@
               <w:rPr>
                 <w:sz w:val="14"/>
               </w:rPr>
-              <w:t>50.4</w:t>
-            </w:r>
-          </w:p>
-        </w:tc>
-        <w:tc>
-          <w:tcPr>
-            <w:tcW w:type="dxa" w:w="1234"/>
-          </w:tcPr>
-          <w:p>
-            <w:r>
-              <w:rPr>
-                <w:sz w:val="14"/>
-              </w:rPr>
-              <w:t>26.1</w:t>
+              <w:t>101.8</w:t>
+            </w:r>
+          </w:p>
+        </w:tc>
+        <w:tc>
+          <w:tcPr>
+            <w:tcW w:type="dxa" w:w="1234"/>
+          </w:tcPr>
+          <w:p>
+            <w:r>
+              <w:rPr>
+                <w:sz w:val="14"/>
+              </w:rPr>
+              <w:t>51.4</w:t>
             </w:r>
           </w:p>
         </w:tc>
@@ -4273,20 +4273,20 @@
               <w:rPr>
                 <w:sz w:val="14"/>
               </w:rPr>
-              <w:t>54</w:t>
-            </w:r>
-          </w:p>
-        </w:tc>
-        <w:tc>
-          <w:tcPr>
-            <w:tcW w:type="dxa" w:w="1234"/>
-          </w:tcPr>
-          <w:p>
-            <w:r>
-              <w:rPr>
-                <w:sz w:val="14"/>
-              </w:rPr>
-              <w:t>39</w:t>
+              <w:t>55</w:t>
+            </w:r>
+          </w:p>
+        </w:tc>
+        <w:tc>
+          <w:tcPr>
+            <w:tcW w:type="dxa" w:w="1234"/>
+          </w:tcPr>
+          <w:p>
+            <w:r>
+              <w:rPr>
+                <w:sz w:val="14"/>
+              </w:rPr>
+              <w:t>40</w:t>
             </w:r>
           </w:p>
         </w:tc>
@@ -4312,7 +4312,7 @@
               <w:rPr>
                 <w:sz w:val="14"/>
               </w:rPr>
-              <w:t>265.6</w:t>
+              <w:t>270.0</w:t>
             </w:r>
           </w:p>
         </w:tc>
@@ -5947,20 +5947,20 @@
               <w:rPr>
                 <w:sz w:val="14"/>
               </w:rPr>
-              <w:t>3</w:t>
-            </w:r>
-          </w:p>
-        </w:tc>
-        <w:tc>
-          <w:tcPr>
-            <w:tcW w:type="dxa" w:w="1234"/>
-          </w:tcPr>
-          <w:p>
-            <w:r>
-              <w:rPr>
-                <w:sz w:val="14"/>
-              </w:rPr>
-              <w:t>3</w:t>
+              <w:t>4</w:t>
+            </w:r>
+          </w:p>
+        </w:tc>
+        <w:tc>
+          <w:tcPr>
+            <w:tcW w:type="dxa" w:w="1234"/>
+          </w:tcPr>
+          <w:p>
+            <w:r>
+              <w:rPr>
+                <w:sz w:val="14"/>
+              </w:rPr>
+              <w:t>4</w:t>
             </w:r>
           </w:p>
         </w:tc>
@@ -5986,7 +5986,7 @@
               <w:rPr>
                 <w:sz w:val="14"/>
               </w:rPr>
-              <w:t>21.1</w:t>
+              <w:t>28.5</w:t>
             </w:r>
           </w:p>
         </w:tc>
@@ -6319,20 +6319,20 @@
               <w:rPr>
                 <w:sz w:val="14"/>
               </w:rPr>
-              <w:t>4</w:t>
-            </w:r>
-          </w:p>
-        </w:tc>
-        <w:tc>
-          <w:tcPr>
-            <w:tcW w:type="dxa" w:w="1234"/>
-          </w:tcPr>
-          <w:p>
-            <w:r>
-              <w:rPr>
-                <w:sz w:val="14"/>
-              </w:rPr>
-              <w:t>4</w:t>
+              <w:t>5</w:t>
+            </w:r>
+          </w:p>
+        </w:tc>
+        <w:tc>
+          <w:tcPr>
+            <w:tcW w:type="dxa" w:w="1234"/>
+          </w:tcPr>
+          <w:p>
+            <w:r>
+              <w:rPr>
+                <w:sz w:val="14"/>
+              </w:rPr>
+              <w:t>5</w:t>
             </w:r>
           </w:p>
         </w:tc>
@@ -6358,20 +6358,20 @@
               <w:rPr>
                 <w:sz w:val="14"/>
               </w:rPr>
-              <w:t>23.3</w:t>
-            </w:r>
-          </w:p>
-        </w:tc>
-        <w:tc>
-          <w:tcPr>
-            <w:tcW w:type="dxa" w:w="1234"/>
-          </w:tcPr>
-          <w:p>
-            <w:r>
-              <w:rPr>
-                <w:sz w:val="14"/>
-              </w:rPr>
-              <w:t>6.2</w:t>
+              <w:t>29.7</w:t>
+            </w:r>
+          </w:p>
+        </w:tc>
+        <w:tc>
+          <w:tcPr>
+            <w:tcW w:type="dxa" w:w="1234"/>
+          </w:tcPr>
+          <w:p>
+            <w:r>
+              <w:rPr>
+                <w:sz w:val="14"/>
+              </w:rPr>
+              <w:t>6.4</w:t>
             </w:r>
           </w:p>
         </w:tc>
@@ -6385,6 +6385,378 @@
                 <w:sz w:val="14"/>
               </w:rPr>
               <w:t>2026-09-11T14:16:47.415728+00:00</w:t>
+            </w:r>
+          </w:p>
+        </w:tc>
+      </w:tr>
+      <w:tr>
+        <w:tc>
+          <w:tcPr>
+            <w:tcW w:type="dxa" w:w="1234"/>
+          </w:tcPr>
+          <w:p>
+            <w:r>
+              <w:rPr>
+                <w:sz w:val="14"/>
+              </w:rPr>
+              <w:t>deploy_task_models</w:t>
+            </w:r>
+          </w:p>
+        </w:tc>
+        <w:tc>
+          <w:tcPr>
+            <w:tcW w:type="dxa" w:w="1234"/>
+          </w:tcPr>
+          <w:p>
+            <w:r>
+              <w:rPr>
+                <w:sz w:val="14"/>
+              </w:rPr>
+              <w:t>3</w:t>
+            </w:r>
+          </w:p>
+        </w:tc>
+        <w:tc>
+          <w:tcPr>
+            <w:tcW w:type="dxa" w:w="1234"/>
+          </w:tcPr>
+          <w:p>
+            <w:r>
+              <w:rPr>
+                <w:sz w:val="14"/>
+              </w:rPr>
+              <w:t>2</w:t>
+            </w:r>
+          </w:p>
+        </w:tc>
+        <w:tc>
+          <w:tcPr>
+            <w:tcW w:type="dxa" w:w="1234"/>
+          </w:tcPr>
+          <w:p>
+            <w:r>
+              <w:rPr>
+                <w:sz w:val="14"/>
+              </w:rPr>
+              <w:t>1</w:t>
+            </w:r>
+          </w:p>
+        </w:tc>
+        <w:tc>
+          <w:tcPr>
+            <w:tcW w:type="dxa" w:w="1234"/>
+          </w:tcPr>
+          <w:p>
+            <w:r>
+              <w:rPr>
+                <w:sz w:val="14"/>
+              </w:rPr>
+              <w:t>1313.6</w:t>
+            </w:r>
+          </w:p>
+        </w:tc>
+        <w:tc>
+          <w:tcPr>
+            <w:tcW w:type="dxa" w:w="1234"/>
+          </w:tcPr>
+          <w:p>
+            <w:r>
+              <w:rPr>
+                <w:sz w:val="14"/>
+              </w:rPr>
+              <w:t>1189.8</w:t>
+            </w:r>
+          </w:p>
+        </w:tc>
+        <w:tc>
+          <w:tcPr>
+            <w:tcW w:type="dxa" w:w="1234"/>
+          </w:tcPr>
+          <w:p>
+            <w:r>
+              <w:rPr>
+                <w:sz w:val="14"/>
+              </w:rPr>
+              <w:t>2026-09-12T09:33:19.789368+00:00</w:t>
+            </w:r>
+          </w:p>
+        </w:tc>
+      </w:tr>
+      <w:tr>
+        <w:tc>
+          <w:tcPr>
+            <w:tcW w:type="dxa" w:w="1234"/>
+          </w:tcPr>
+          <w:p>
+            <w:r>
+              <w:rPr>
+                <w:sz w:val="14"/>
+              </w:rPr>
+              <w:t>final_qa_sweep</w:t>
+            </w:r>
+          </w:p>
+        </w:tc>
+        <w:tc>
+          <w:tcPr>
+            <w:tcW w:type="dxa" w:w="1234"/>
+          </w:tcPr>
+          <w:p>
+            <w:r>
+              <w:rPr>
+                <w:sz w:val="14"/>
+              </w:rPr>
+              <w:t>6</w:t>
+            </w:r>
+          </w:p>
+        </w:tc>
+        <w:tc>
+          <w:tcPr>
+            <w:tcW w:type="dxa" w:w="1234"/>
+          </w:tcPr>
+          <w:p>
+            <w:r>
+              <w:rPr>
+                <w:sz w:val="14"/>
+              </w:rPr>
+              <w:t>6</w:t>
+            </w:r>
+          </w:p>
+        </w:tc>
+        <w:tc>
+          <w:tcPr>
+            <w:tcW w:type="dxa" w:w="1234"/>
+          </w:tcPr>
+          <w:p>
+            <w:r>
+              <w:rPr>
+                <w:sz w:val="14"/>
+              </w:rPr>
+              <w:t>0</w:t>
+            </w:r>
+          </w:p>
+        </w:tc>
+        <w:tc>
+          <w:tcPr>
+            <w:tcW w:type="dxa" w:w="1234"/>
+          </w:tcPr>
+          <w:p>
+            <w:r>
+              <w:rPr>
+                <w:sz w:val="14"/>
+              </w:rPr>
+              <w:t>28.4</w:t>
+            </w:r>
+          </w:p>
+        </w:tc>
+        <w:tc>
+          <w:tcPr>
+            <w:tcW w:type="dxa" w:w="1234"/>
+          </w:tcPr>
+          <w:p>
+            <w:r>
+              <w:rPr>
+                <w:sz w:val="14"/>
+              </w:rPr>
+              <w:t>5.8</w:t>
+            </w:r>
+          </w:p>
+        </w:tc>
+        <w:tc>
+          <w:tcPr>
+            <w:tcW w:type="dxa" w:w="1234"/>
+          </w:tcPr>
+          <w:p>
+            <w:r>
+              <w:rPr>
+                <w:sz w:val="14"/>
+              </w:rPr>
+              <w:t>2026-09-12T13:36:39.814565+00:00</w:t>
+            </w:r>
+          </w:p>
+        </w:tc>
+      </w:tr>
+      <w:tr>
+        <w:tc>
+          <w:tcPr>
+            <w:tcW w:type="dxa" w:w="1234"/>
+          </w:tcPr>
+          <w:p>
+            <w:r>
+              <w:rPr>
+                <w:sz w:val="14"/>
+              </w:rPr>
+              <w:t>compliance_review</w:t>
+            </w:r>
+          </w:p>
+        </w:tc>
+        <w:tc>
+          <w:tcPr>
+            <w:tcW w:type="dxa" w:w="1234"/>
+          </w:tcPr>
+          <w:p>
+            <w:r>
+              <w:rPr>
+                <w:sz w:val="14"/>
+              </w:rPr>
+              <w:t>9</w:t>
+            </w:r>
+          </w:p>
+        </w:tc>
+        <w:tc>
+          <w:tcPr>
+            <w:tcW w:type="dxa" w:w="1234"/>
+          </w:tcPr>
+          <w:p>
+            <w:r>
+              <w:rPr>
+                <w:sz w:val="14"/>
+              </w:rPr>
+              <w:t>9</w:t>
+            </w:r>
+          </w:p>
+        </w:tc>
+        <w:tc>
+          <w:tcPr>
+            <w:tcW w:type="dxa" w:w="1234"/>
+          </w:tcPr>
+          <w:p>
+            <w:r>
+              <w:rPr>
+                <w:sz w:val="14"/>
+              </w:rPr>
+              <w:t>0</w:t>
+            </w:r>
+          </w:p>
+        </w:tc>
+        <w:tc>
+          <w:tcPr>
+            <w:tcW w:type="dxa" w:w="1234"/>
+          </w:tcPr>
+          <w:p>
+            <w:r>
+              <w:rPr>
+                <w:sz w:val="14"/>
+              </w:rPr>
+              <w:t>53.4</w:t>
+            </w:r>
+          </w:p>
+        </w:tc>
+        <w:tc>
+          <w:tcPr>
+            <w:tcW w:type="dxa" w:w="1234"/>
+          </w:tcPr>
+          <w:p>
+            <w:r>
+              <w:rPr>
+                <w:sz w:val="14"/>
+              </w:rPr>
+              <w:t>6.6</w:t>
+            </w:r>
+          </w:p>
+        </w:tc>
+        <w:tc>
+          <w:tcPr>
+            <w:tcW w:type="dxa" w:w="1234"/>
+          </w:tcPr>
+          <w:p>
+            <w:r>
+              <w:rPr>
+                <w:sz w:val="14"/>
+              </w:rPr>
+              <w:t>2026-09-12T13:43:34.855315+00:00</w:t>
+            </w:r>
+          </w:p>
+        </w:tc>
+      </w:tr>
+      <w:tr>
+        <w:tc>
+          <w:tcPr>
+            <w:tcW w:type="dxa" w:w="1234"/>
+          </w:tcPr>
+          <w:p>
+            <w:r>
+              <w:rPr>
+                <w:sz w:val="14"/>
+              </w:rPr>
+              <w:t>package_delivery</w:t>
+            </w:r>
+          </w:p>
+        </w:tc>
+        <w:tc>
+          <w:tcPr>
+            <w:tcW w:type="dxa" w:w="1234"/>
+          </w:tcPr>
+          <w:p>
+            <w:r>
+              <w:rPr>
+                <w:sz w:val="14"/>
+              </w:rPr>
+              <w:t>8</w:t>
+            </w:r>
+          </w:p>
+        </w:tc>
+        <w:tc>
+          <w:tcPr>
+            <w:tcW w:type="dxa" w:w="1234"/>
+          </w:tcPr>
+          <w:p>
+            <w:r>
+              <w:rPr>
+                <w:sz w:val="14"/>
+              </w:rPr>
+              <w:t>8</w:t>
+            </w:r>
+          </w:p>
+        </w:tc>
+        <w:tc>
+          <w:tcPr>
+            <w:tcW w:type="dxa" w:w="1234"/>
+          </w:tcPr>
+          <w:p>
+            <w:r>
+              <w:rPr>
+                <w:sz w:val="14"/>
+              </w:rPr>
+              <w:t>0</w:t>
+            </w:r>
+          </w:p>
+        </w:tc>
+        <w:tc>
+          <w:tcPr>
+            <w:tcW w:type="dxa" w:w="1234"/>
+          </w:tcPr>
+          <w:p>
+            <w:r>
+              <w:rPr>
+                <w:sz w:val="14"/>
+              </w:rPr>
+              <w:t>193.9</w:t>
+            </w:r>
+          </w:p>
+        </w:tc>
+        <w:tc>
+          <w:tcPr>
+            <w:tcW w:type="dxa" w:w="1234"/>
+          </w:tcPr>
+          <w:p>
+            <w:r>
+              <w:rPr>
+                <w:sz w:val="14"/>
+              </w:rPr>
+              <w:t>63.7</w:t>
+            </w:r>
+          </w:p>
+        </w:tc>
+        <w:tc>
+          <w:tcPr>
+            <w:tcW w:type="dxa" w:w="1234"/>
+          </w:tcPr>
+          <w:p>
+            <w:r>
+              <w:rPr>
+                <w:sz w:val="14"/>
+              </w:rPr>
+              <w:t>2026-09-12T13:59:20.085916+00:00</w:t>
             </w:r>
           </w:p>
         </w:tc>
@@ -7481,7 +7853,7 @@
               <w:rPr>
                 <w:sz w:val="14"/>
               </w:rPr>
-              <w:t>python scripts/11_run_experiment.py --exp EXP-B2 --planner nested</w:t>
+              <w:t>python scripts/11_run_experiment.py --exp EXP-B1 --variant defaults --out-dir &lt;scratch&gt; --no-resume</w:t>
             </w:r>
           </w:p>
         </w:tc>
@@ -7494,7 +7866,7 @@
               <w:rPr>
                 <w:sz w:val="14"/>
               </w:rPr>
-              <w:t>EXP-B2, EXP-B2-AGG</w:t>
+              <w:t>REPRO-01</w:t>
             </w:r>
           </w:p>
         </w:tc>
@@ -7509,7 +7881,7 @@
               <w:rPr>
                 <w:sz w:val="14"/>
               </w:rPr>
-              <w:t>python scripts/11_run_experiment.py --exp EXP-B2 --variant defaults</w:t>
+              <w:t>python scripts/11_run_experiment.py --exp EXP-B2 --planner nested</w:t>
             </w:r>
           </w:p>
         </w:tc>
@@ -7522,7 +7894,7 @@
               <w:rPr>
                 <w:sz w:val="14"/>
               </w:rPr>
-              <w:t>EXP-B2-defaults, EXP-B2-defaults-AGG</w:t>
+              <w:t>EXP-B2, EXP-B2-AGG</w:t>
             </w:r>
           </w:p>
         </w:tc>
@@ -7537,7 +7909,7 @@
               <w:rPr>
                 <w:sz w:val="14"/>
               </w:rPr>
-              <w:t>python scripts/11_run_experiment.py --exp EXP-C1 --planner nested --variant three_class</w:t>
+              <w:t>python scripts/11_run_experiment.py --exp EXP-B2 --variant defaults</w:t>
             </w:r>
           </w:p>
         </w:tc>
@@ -7550,7 +7922,7 @@
               <w:rPr>
                 <w:sz w:val="14"/>
               </w:rPr>
-              <w:t>EXP-C1-three_class, EXP-C1-three_class-AGG</w:t>
+              <w:t>EXP-B2-defaults, EXP-B2-defaults-AGG</w:t>
             </w:r>
           </w:p>
         </w:tc>
@@ -7565,7 +7937,7 @@
               <w:rPr>
                 <w:sz w:val="14"/>
               </w:rPr>
-              <w:t>python scripts/11_run_experiment.py --exp EXP-C1 --planner nested --variant two_class</w:t>
+              <w:t>python scripts/11_run_experiment.py --exp EXP-C1 --planner nested --variant three_class</w:t>
             </w:r>
           </w:p>
         </w:tc>
@@ -7578,7 +7950,7 @@
               <w:rPr>
                 <w:sz w:val="14"/>
               </w:rPr>
-              <w:t>EXP-C1-two_class, EXP-C1-two_class-AGG</w:t>
+              <w:t>EXP-C1-three_class, EXP-C1-three_class-AGG</w:t>
             </w:r>
           </w:p>
         </w:tc>
@@ -7593,7 +7965,7 @@
               <w:rPr>
                 <w:sz w:val="14"/>
               </w:rPr>
-              <w:t>python scripts/11_run_experiment.py --exp EXP-C2 --planner nested</w:t>
+              <w:t>python scripts/11_run_experiment.py --exp EXP-C1 --planner nested --variant two_class</w:t>
             </w:r>
           </w:p>
         </w:tc>
@@ -7606,7 +7978,7 @@
               <w:rPr>
                 <w:sz w:val="14"/>
               </w:rPr>
-              <w:t>EXP-C2, EXP-C2-AGG</w:t>
+              <w:t>EXP-C1-two_class, EXP-C1-two_class-AGG</w:t>
             </w:r>
           </w:p>
         </w:tc>
@@ -7621,7 +7993,7 @@
               <w:rPr>
                 <w:sz w:val="14"/>
               </w:rPr>
-              <w:t>python scripts/13_finalize_binary_model.py</w:t>
+              <w:t>python scripts/11_run_experiment.py --exp EXP-C2 --planner nested</w:t>
             </w:r>
           </w:p>
         </w:tc>
@@ -7634,7 +8006,7 @@
               <w:rPr>
                 <w:sz w:val="14"/>
               </w:rPr>
-              <w:t>T65-SELECTION, T65-FINAL-MODEL</w:t>
+              <w:t>EXP-C2, EXP-C2-AGG</w:t>
             </w:r>
           </w:p>
         </w:tc>
@@ -7649,7 +8021,7 @@
               <w:rPr>
                 <w:sz w:val="14"/>
               </w:rPr>
-              <w:t>python scripts/18_setup_tables.py --tables T01 T02 T03 T04 T05 T06 T07</w:t>
+              <w:t>python scripts/13_finalize_binary_model.py</w:t>
             </w:r>
           </w:p>
         </w:tc>
@@ -7662,7 +8034,7 @@
               <w:rPr>
                 <w:sz w:val="14"/>
               </w:rPr>
-              <w:t>T01, T02, T03, T04, T05, T06</w:t>
+              <w:t>T65-SELECTION, T65-FINAL-MODEL</w:t>
             </w:r>
           </w:p>
         </w:tc>
@@ -7677,7 +8049,7 @@
               <w:rPr>
                 <w:sz w:val="14"/>
               </w:rPr>
-              <w:t>python scripts/19_data_graphs.py --figures G01 G02 G03 G04 G05 G06 G07 G08 G09 G10</w:t>
+              <w:t>python scripts/18_setup_tables.py --tables T01 T02 T03 T04 T05 T06 T07</w:t>
             </w:r>
           </w:p>
         </w:tc>
@@ -7690,7 +8062,7 @@
               <w:rPr>
                 <w:sz w:val="14"/>
               </w:rPr>
-              <w:t>G01, G02, G03, G04, G05, G06, G07, G08, G09</w:t>
+              <w:t>T01, T02, T03, T04, T05, T06</w:t>
             </w:r>
           </w:p>
         </w:tc>
@@ -7705,7 +8077,7 @@
               <w:rPr>
                 <w:sz w:val="14"/>
               </w:rPr>
-              <w:t>python scripts/21_location_analysis.py</w:t>
+              <w:t>python scripts/19_data_graphs.py --figures G01 G02 G03 G04 G05 G06 G07 G08 G09 G10</w:t>
             </w:r>
           </w:p>
         </w:tc>
@@ -7718,7 +8090,7 @@
               <w:rPr>
                 <w:sz w:val="14"/>
               </w:rPr>
-              <w:t>T22, G32</w:t>
+              <w:t>G01, G02, G03, G04, G05, G06, G07, G08, G09</w:t>
             </w:r>
           </w:p>
         </w:tc>
@@ -7733,7 +8105,7 @@
               <w:rPr>
                 <w:sz w:val="14"/>
               </w:rPr>
-              <w:t>python scripts/22_cross_dataset.py</w:t>
+              <w:t>python scripts/21_location_analysis.py</w:t>
             </w:r>
           </w:p>
         </w:tc>
@@ -7746,7 +8118,7 @@
               <w:rPr>
                 <w:sz w:val="14"/>
               </w:rPr>
-              <w:t>T16, G29</w:t>
+              <w:t>T22, G32</w:t>
             </w:r>
           </w:p>
         </w:tc>
@@ -7761,7 +8133,7 @@
               <w:rPr>
                 <w:sz w:val="14"/>
               </w:rPr>
-              <w:t>python scripts/23_noise_robustness.py</w:t>
+              <w:t>python scripts/22_cross_dataset.py</w:t>
             </w:r>
           </w:p>
         </w:tc>
@@ -7774,7 +8146,7 @@
               <w:rPr>
                 <w:sz w:val="14"/>
               </w:rPr>
-              <w:t>T20, G30</w:t>
+              <w:t>T16, G29</w:t>
             </w:r>
           </w:p>
         </w:tc>
@@ -7789,7 +8161,7 @@
               <w:rPr>
                 <w:sz w:val="14"/>
               </w:rPr>
-              <w:t>python scripts/24_duration_robustness.py</w:t>
+              <w:t>python scripts/23_noise_robustness.py</w:t>
             </w:r>
           </w:p>
         </w:tc>
@@ -7802,7 +8174,7 @@
               <w:rPr>
                 <w:sz w:val="14"/>
               </w:rPr>
-              <w:t>T21, G31</w:t>
+              <w:t>T20, G30</w:t>
             </w:r>
           </w:p>
         </w:tc>
@@ -7817,7 +8189,7 @@
               <w:rPr>
                 <w:sz w:val="14"/>
               </w:rPr>
-              <w:t>python scripts/25_preprocessing_ablation.py</w:t>
+              <w:t>python scripts/24_duration_robustness.py</w:t>
             </w:r>
           </w:p>
         </w:tc>
@@ -7830,7 +8202,7 @@
               <w:rPr>
                 <w:sz w:val="14"/>
               </w:rPr>
-              <w:t>PP-09</w:t>
+              <w:t>T21, G31</w:t>
             </w:r>
           </w:p>
         </w:tc>
@@ -7845,7 +8217,7 @@
               <w:rPr>
                 <w:sz w:val="14"/>
               </w:rPr>
-              <w:t>python scripts/26_feature_ablation.py</w:t>
+              <w:t>python scripts/25_preprocessing_ablation.py</w:t>
             </w:r>
           </w:p>
         </w:tc>
@@ -7858,7 +8230,7 @@
               <w:rPr>
                 <w:sz w:val="14"/>
               </w:rPr>
-              <w:t>T17, T18</w:t>
+              <w:t>PP-09</w:t>
             </w:r>
           </w:p>
         </w:tc>
@@ -7873,7 +8245,7 @@
               <w:rPr>
                 <w:sz w:val="14"/>
               </w:rPr>
-              <w:t>python scripts/27_optimization_ablation.py</w:t>
+              <w:t>python scripts/26_feature_ablation.py</w:t>
             </w:r>
           </w:p>
         </w:tc>
@@ -7886,7 +8258,7 @@
               <w:rPr>
                 <w:sz w:val="14"/>
               </w:rPr>
-              <w:t>T19, G23, G24, EXP-F2-A9-DEFAULT, EXP-F2-A9-TUNED, EXP-F2-A10</w:t>
+              <w:t>T17, T18</w:t>
             </w:r>
           </w:p>
         </w:tc>
@@ -7901,7 +8273,7 @@
               <w:rPr>
                 <w:sz w:val="14"/>
               </w:rPr>
-              <w:t>python scripts/28_diagnosis_track.py</w:t>
+              <w:t>python scripts/27_optimization_ablation.py</w:t>
             </w:r>
           </w:p>
         </w:tc>
@@ -7914,7 +8286,7 @@
               <w:rPr>
                 <w:sz w:val="14"/>
               </w:rPr>
-              <w:t>T-S1, T-S2, T-S3, T-S4</w:t>
+              <w:t>T19, G23, G24, EXP-F2-A9-DEFAULT, EXP-F2-A9-TUNED, EXP-F2-A10</w:t>
             </w:r>
           </w:p>
         </w:tc>
@@ -7929,7 +8301,7 @@
               <w:rPr>
                 <w:sz w:val="14"/>
               </w:rPr>
-              <w:t>python scripts/29_source_holdout.py</w:t>
+              <w:t>python scripts/28_diagnosis_track.py</w:t>
             </w:r>
           </w:p>
         </w:tc>
@@ -7942,7 +8314,7 @@
               <w:rPr>
                 <w:sz w:val="14"/>
               </w:rPr>
-              <w:t>T-S5</w:t>
+              <w:t>T-S1, T-S2, T-S3, T-S4</w:t>
             </w:r>
           </w:p>
         </w:tc>
@@ -7957,7 +8329,7 @@
               <w:rPr>
                 <w:sz w:val="14"/>
               </w:rPr>
-              <w:t>python scripts/30_calibration_analysis.py</w:t>
+              <w:t>python scripts/29_source_holdout.py</w:t>
             </w:r>
           </w:p>
         </w:tc>
@@ -7970,7 +8342,7 @@
               <w:rPr>
                 <w:sz w:val="14"/>
               </w:rPr>
-              <w:t>T23, G33, G34</w:t>
+              <w:t>T-S5</w:t>
             </w:r>
           </w:p>
         </w:tc>
@@ -7985,7 +8357,7 @@
               <w:rPr>
                 <w:sz w:val="14"/>
               </w:rPr>
-              <w:t>python scripts/31_complexity_analysis.py</w:t>
+              <w:t>python scripts/30_calibration_analysis.py</w:t>
             </w:r>
           </w:p>
         </w:tc>
@@ -7998,7 +8370,7 @@
               <w:rPr>
                 <w:sz w:val="14"/>
               </w:rPr>
-              <w:t>T24, T25, T26, G25, G26, G27</w:t>
+              <w:t>T23, G33, G34</w:t>
             </w:r>
           </w:p>
         </w:tc>
@@ -8013,7 +8385,7 @@
               <w:rPr>
                 <w:sz w:val="14"/>
               </w:rPr>
-              <w:t>python scripts/32_failure_analysis.py</w:t>
+              <w:t>python scripts/31_complexity_analysis.py</w:t>
             </w:r>
           </w:p>
         </w:tc>
@@ -8026,7 +8398,7 @@
               <w:rPr>
                 <w:sz w:val="14"/>
               </w:rPr>
-              <w:t>T27, G35</w:t>
+              <w:t>T24, T25, T26, G25, G26, G27</w:t>
             </w:r>
           </w:p>
         </w:tc>
@@ -8041,7 +8413,7 @@
               <w:rPr>
                 <w:sz w:val="14"/>
               </w:rPr>
-              <w:t>python scripts/33_explainability.py</w:t>
+              <w:t>python scripts/32_failure_analysis.py</w:t>
             </w:r>
           </w:p>
         </w:tc>
@@ -8054,7 +8426,7 @@
               <w:rPr>
                 <w:sz w:val="14"/>
               </w:rPr>
-              <w:t>FE-11, G18, G19</w:t>
+              <w:t>T27, G35</w:t>
             </w:r>
           </w:p>
         </w:tc>
@@ -8069,7 +8441,7 @@
               <w:rPr>
                 <w:sz w:val="14"/>
               </w:rPr>
-              <w:t>python scripts/34_statistical_validation.py</w:t>
+              <w:t>python scripts/33_explainability.py</w:t>
             </w:r>
           </w:p>
         </w:tc>
@@ -8082,7 +8454,7 @@
               <w:rPr>
                 <w:sz w:val="14"/>
               </w:rPr>
-              <w:t>STAT-BOOTSTRAP</w:t>
+              <w:t>FE-11, G18, G19</w:t>
             </w:r>
           </w:p>
         </w:tc>
@@ -8097,7 +8469,7 @@
               <w:rPr>
                 <w:sz w:val="14"/>
               </w:rPr>
-              <w:t>python scripts/35_statistical_reporting.py</w:t>
+              <w:t>python scripts/34_statistical_validation.py</w:t>
             </w:r>
           </w:p>
         </w:tc>
@@ -8110,7 +8482,7 @@
               <w:rPr>
                 <w:sz w:val="14"/>
               </w:rPr>
-              <w:t>T28, STAT-01, STAT-02, STAT-03, STAT-04</w:t>
+              <w:t>STAT-BOOTSTRAP</w:t>
             </w:r>
           </w:p>
         </w:tc>
@@ -8125,7 +8497,7 @@
               <w:rPr>
                 <w:sz w:val="14"/>
               </w:rPr>
-              <w:t>python scripts/36_cycle_analysis.py</w:t>
+              <w:t>python scripts/35_statistical_reporting.py</w:t>
             </w:r>
           </w:p>
         </w:tc>
@@ -8138,7 +8510,7 @@
               <w:rPr>
                 <w:sz w:val="14"/>
               </w:rPr>
-              <w:t>SEG-01, SEG-02</w:t>
+              <w:t>T28, STAT-01, STAT-02, STAT-03, STAT-04</w:t>
             </w:r>
           </w:p>
         </w:tc>
@@ -8153,7 +8525,7 @@
               <w:rPr>
                 <w:sz w:val="14"/>
               </w:rPr>
-              <w:t>python scripts/37_result_tables.py --tables T08 T09 T10 T11 T12 T13 T14 T15</w:t>
+              <w:t>python scripts/36_cycle_analysis.py</w:t>
             </w:r>
           </w:p>
         </w:tc>
@@ -8166,7 +8538,7 @@
               <w:rPr>
                 <w:sz w:val="14"/>
               </w:rPr>
-              <w:t>T08, T09, T10, T11, T12, T13, T14, T15</w:t>
+              <w:t>SEG-01, SEG-02</w:t>
             </w:r>
           </w:p>
         </w:tc>
@@ -8181,7 +8553,7 @@
               <w:rPr>
                 <w:sz w:val="14"/>
               </w:rPr>
-              <w:t>python scripts/37_result_tables.py --tables T29 T30</w:t>
+              <w:t>python scripts/37_result_tables.py --tables T08 T09 T10 T11 T12 T13 T14 T15</w:t>
             </w:r>
           </w:p>
         </w:tc>
@@ -8194,7 +8566,7 @@
               <w:rPr>
                 <w:sz w:val="14"/>
               </w:rPr>
-              <w:t>T29, T30</w:t>
+              <w:t>T08, T09, T10, T11, T12, T13, T14, T15</w:t>
             </w:r>
           </w:p>
         </w:tc>
@@ -8209,7 +8581,7 @@
               <w:rPr>
                 <w:sz w:val="14"/>
               </w:rPr>
-              <w:t>python scripts/38_result_graphs.py --figures G11 G12 G13 G14 G15 G16 G17</w:t>
+              <w:t>python scripts/37_result_tables.py --tables T29 T30</w:t>
             </w:r>
           </w:p>
         </w:tc>
@@ -8222,7 +8594,7 @@
               <w:rPr>
                 <w:sz w:val="14"/>
               </w:rPr>
-              <w:t>G11, G12, G13, G14, G15, G16, G17</w:t>
+              <w:t>T29, T30</w:t>
             </w:r>
           </w:p>
         </w:tc>
@@ -8237,7 +8609,7 @@
               <w:rPr>
                 <w:sz w:val="14"/>
               </w:rPr>
-              <w:t>python scripts/38_result_graphs.py --figures G28</w:t>
+              <w:t>python scripts/38_result_graphs.py --figures G11 G12 G13 G14 G15 G16 G17</w:t>
             </w:r>
           </w:p>
         </w:tc>
@@ -8250,7 +8622,7 @@
               <w:rPr>
                 <w:sz w:val="14"/>
               </w:rPr>
-              <w:t>G28</w:t>
+              <w:t>G11, G12, G13, G14, G15, G16, G17</w:t>
             </w:r>
           </w:p>
         </w:tc>
@@ -8265,7 +8637,7 @@
               <w:rPr>
                 <w:sz w:val="14"/>
               </w:rPr>
-              <w:t>python scripts/39_export_algorithms.py --ids ALG-01</w:t>
+              <w:t>python scripts/38_result_graphs.py --figures G28</w:t>
             </w:r>
           </w:p>
         </w:tc>
@@ -8278,7 +8650,7 @@
               <w:rPr>
                 <w:sz w:val="14"/>
               </w:rPr>
-              <w:t>ALG-01</w:t>
+              <w:t>G28</w:t>
             </w:r>
           </w:p>
         </w:tc>
@@ -8293,7 +8665,7 @@
               <w:rPr>
                 <w:sz w:val="14"/>
               </w:rPr>
-              <w:t>python scripts/39_export_algorithms.py --ids ALG-02</w:t>
+              <w:t>python scripts/39_export_algorithms.py --ids ALG-01</w:t>
             </w:r>
           </w:p>
         </w:tc>
@@ -8306,7 +8678,7 @@
               <w:rPr>
                 <w:sz w:val="14"/>
               </w:rPr>
-              <w:t>ALG-02</w:t>
+              <w:t>ALG-01</w:t>
             </w:r>
           </w:p>
         </w:tc>
@@ -8321,7 +8693,7 @@
               <w:rPr>
                 <w:sz w:val="14"/>
               </w:rPr>
-              <w:t>python scripts/39_export_algorithms.py --ids ALG-03</w:t>
+              <w:t>python scripts/39_export_algorithms.py --ids ALG-02</w:t>
             </w:r>
           </w:p>
         </w:tc>
@@ -8334,7 +8706,7 @@
               <w:rPr>
                 <w:sz w:val="14"/>
               </w:rPr>
-              <w:t>ALG-03</w:t>
+              <w:t>ALG-02</w:t>
             </w:r>
           </w:p>
         </w:tc>
@@ -8349,7 +8721,7 @@
               <w:rPr>
                 <w:sz w:val="14"/>
               </w:rPr>
-              <w:t>python scripts/39_export_algorithms.py --ids ALG-04</w:t>
+              <w:t>python scripts/39_export_algorithms.py --ids ALG-03</w:t>
             </w:r>
           </w:p>
         </w:tc>
@@ -8362,7 +8734,7 @@
               <w:rPr>
                 <w:sz w:val="14"/>
               </w:rPr>
-              <w:t>ALG-04</w:t>
+              <w:t>ALG-03</w:t>
             </w:r>
           </w:p>
         </w:tc>
@@ -8377,7 +8749,7 @@
               <w:rPr>
                 <w:sz w:val="14"/>
               </w:rPr>
-              <w:t>python scripts/39_export_algorithms.py --ids ALG-05</w:t>
+              <w:t>python scripts/39_export_algorithms.py --ids ALG-04</w:t>
             </w:r>
           </w:p>
         </w:tc>
@@ -8390,7 +8762,7 @@
               <w:rPr>
                 <w:sz w:val="14"/>
               </w:rPr>
-              <w:t>ALG-05</w:t>
+              <w:t>ALG-04</w:t>
             </w:r>
           </w:p>
         </w:tc>
@@ -8405,7 +8777,7 @@
               <w:rPr>
                 <w:sz w:val="14"/>
               </w:rPr>
-              <w:t>python scripts/39_export_algorithms.py --ids ALG-06</w:t>
+              <w:t>python scripts/39_export_algorithms.py --ids ALG-05</w:t>
             </w:r>
           </w:p>
         </w:tc>
@@ -8418,7 +8790,7 @@
               <w:rPr>
                 <w:sz w:val="14"/>
               </w:rPr>
-              <w:t>ALG-06</w:t>
+              <w:t>ALG-05</w:t>
             </w:r>
           </w:p>
         </w:tc>
@@ -8433,7 +8805,7 @@
               <w:rPr>
                 <w:sz w:val="14"/>
               </w:rPr>
-              <w:t>python scripts/39_export_algorithms.py --ids ALG-07</w:t>
+              <w:t>python scripts/39_export_algorithms.py --ids ALG-06</w:t>
             </w:r>
           </w:p>
         </w:tc>
@@ -8446,7 +8818,7 @@
               <w:rPr>
                 <w:sz w:val="14"/>
               </w:rPr>
-              <w:t>ALG-07</w:t>
+              <w:t>ALG-06</w:t>
             </w:r>
           </w:p>
         </w:tc>
@@ -8461,7 +8833,7 @@
               <w:rPr>
                 <w:sz w:val="14"/>
               </w:rPr>
-              <w:t>python scripts/39_export_algorithms.py --ids ALG-08</w:t>
+              <w:t>python scripts/39_export_algorithms.py --ids ALG-07</w:t>
             </w:r>
           </w:p>
         </w:tc>
@@ -8474,7 +8846,7 @@
               <w:rPr>
                 <w:sz w:val="14"/>
               </w:rPr>
-              <w:t>ALG-08</w:t>
+              <w:t>ALG-07</w:t>
             </w:r>
           </w:p>
         </w:tc>
@@ -8489,7 +8861,7 @@
               <w:rPr>
                 <w:sz w:val="14"/>
               </w:rPr>
-              <w:t>python scripts/39_export_algorithms.py --ids ALG-09</w:t>
+              <w:t>python scripts/39_export_algorithms.py --ids ALG-08</w:t>
             </w:r>
           </w:p>
         </w:tc>
@@ -8502,7 +8874,7 @@
               <w:rPr>
                 <w:sz w:val="14"/>
               </w:rPr>
-              <w:t>ALG-09</w:t>
+              <w:t>ALG-08</w:t>
             </w:r>
           </w:p>
         </w:tc>
@@ -8517,7 +8889,7 @@
               <w:rPr>
                 <w:sz w:val="14"/>
               </w:rPr>
-              <w:t>python scripts/39_export_algorithms.py --ids ALG-10</w:t>
+              <w:t>python scripts/39_export_algorithms.py --ids ALG-09</w:t>
             </w:r>
           </w:p>
         </w:tc>
@@ -8530,7 +8902,7 @@
               <w:rPr>
                 <w:sz w:val="14"/>
               </w:rPr>
-              <w:t>ALG-10</w:t>
+              <w:t>ALG-09</w:t>
             </w:r>
           </w:p>
         </w:tc>
@@ -8545,7 +8917,7 @@
               <w:rPr>
                 <w:sz w:val="14"/>
               </w:rPr>
-              <w:t>python scripts/39_export_algorithms.py --ids ALG-11</w:t>
+              <w:t>python scripts/39_export_algorithms.py --ids ALG-10</w:t>
             </w:r>
           </w:p>
         </w:tc>
@@ -8558,7 +8930,7 @@
               <w:rPr>
                 <w:sz w:val="14"/>
               </w:rPr>
-              <w:t>ALG-11</w:t>
+              <w:t>ALG-10</w:t>
             </w:r>
           </w:p>
         </w:tc>
@@ -8573,7 +8945,7 @@
               <w:rPr>
                 <w:sz w:val="14"/>
               </w:rPr>
-              <w:t>python scripts/39_export_algorithms.py --ids ALG-12</w:t>
+              <w:t>python scripts/39_export_algorithms.py --ids ALG-11</w:t>
             </w:r>
           </w:p>
         </w:tc>
@@ -8586,7 +8958,7 @@
               <w:rPr>
                 <w:sz w:val="14"/>
               </w:rPr>
-              <w:t>ALG-12</w:t>
+              <w:t>ALG-11</w:t>
             </w:r>
           </w:p>
         </w:tc>
@@ -8601,7 +8973,7 @@
               <w:rPr>
                 <w:sz w:val="14"/>
               </w:rPr>
-              <w:t>python scripts/39_export_algorithms.py --ids ALG-13</w:t>
+              <w:t>python scripts/39_export_algorithms.py --ids ALG-12</w:t>
             </w:r>
           </w:p>
         </w:tc>
@@ -8614,7 +8986,7 @@
               <w:rPr>
                 <w:sz w:val="14"/>
               </w:rPr>
-              <w:t>ALG-13</w:t>
+              <w:t>ALG-12</w:t>
             </w:r>
           </w:p>
         </w:tc>
@@ -8629,7 +9001,7 @@
               <w:rPr>
                 <w:sz w:val="14"/>
               </w:rPr>
-              <w:t>python scripts/39_export_algorithms.py --ids ALG-14</w:t>
+              <w:t>python scripts/39_export_algorithms.py --ids ALG-13</w:t>
             </w:r>
           </w:p>
         </w:tc>
@@ -8642,7 +9014,7 @@
               <w:rPr>
                 <w:sz w:val="14"/>
               </w:rPr>
-              <w:t>ALG-14</w:t>
+              <w:t>ALG-13</w:t>
             </w:r>
           </w:p>
         </w:tc>
@@ -8657,7 +9029,7 @@
               <w:rPr>
                 <w:sz w:val="14"/>
               </w:rPr>
-              <w:t>python scripts/39_export_algorithms.py --ids ALG-15</w:t>
+              <w:t>python scripts/39_export_algorithms.py --ids ALG-14</w:t>
             </w:r>
           </w:p>
         </w:tc>
@@ -8670,7 +9042,7 @@
               <w:rPr>
                 <w:sz w:val="14"/>
               </w:rPr>
-              <w:t>ALG-15</w:t>
+              <w:t>ALG-14</w:t>
             </w:r>
           </w:p>
         </w:tc>
@@ -8685,7 +9057,7 @@
               <w:rPr>
                 <w:sz w:val="14"/>
               </w:rPr>
-              <w:t>python scripts/39_export_algorithms.py --ids ALG-16</w:t>
+              <w:t>python scripts/39_export_algorithms.py --ids ALG-15</w:t>
             </w:r>
           </w:p>
         </w:tc>
@@ -8698,7 +9070,7 @@
               <w:rPr>
                 <w:sz w:val="14"/>
               </w:rPr>
-              <w:t>ALG-16</w:t>
+              <w:t>ALG-15</w:t>
             </w:r>
           </w:p>
         </w:tc>
@@ -8713,7 +9085,7 @@
               <w:rPr>
                 <w:sz w:val="14"/>
               </w:rPr>
-              <w:t>python scripts/39_export_algorithms.py --ids ALG-17</w:t>
+              <w:t>python scripts/39_export_algorithms.py --ids ALG-16</w:t>
             </w:r>
           </w:p>
         </w:tc>
@@ -8726,7 +9098,7 @@
               <w:rPr>
                 <w:sz w:val="14"/>
               </w:rPr>
-              <w:t>ALG-17</w:t>
+              <w:t>ALG-16</w:t>
             </w:r>
           </w:p>
         </w:tc>
@@ -8741,7 +9113,7 @@
               <w:rPr>
                 <w:sz w:val="14"/>
               </w:rPr>
-              <w:t>python scripts/39_export_algorithms.py --ids ALG-18</w:t>
+              <w:t>python scripts/39_export_algorithms.py --ids ALG-17</w:t>
             </w:r>
           </w:p>
         </w:tc>
@@ -8754,7 +9126,7 @@
               <w:rPr>
                 <w:sz w:val="14"/>
               </w:rPr>
-              <w:t>ALG-18</w:t>
+              <w:t>ALG-17</w:t>
             </w:r>
           </w:p>
         </w:tc>
@@ -8769,7 +9141,7 @@
               <w:rPr>
                 <w:sz w:val="14"/>
               </w:rPr>
-              <w:t>python scripts/39_export_algorithms.py --ids ALG-19</w:t>
+              <w:t>python scripts/39_export_algorithms.py --ids ALG-18</w:t>
             </w:r>
           </w:p>
         </w:tc>
@@ -8782,7 +9154,7 @@
               <w:rPr>
                 <w:sz w:val="14"/>
               </w:rPr>
-              <w:t>ALG-19</w:t>
+              <w:t>ALG-18</w:t>
             </w:r>
           </w:p>
         </w:tc>
@@ -8797,7 +9169,7 @@
               <w:rPr>
                 <w:sz w:val="14"/>
               </w:rPr>
-              <w:t>python scripts/39_export_algorithms.py --ids ALG-20</w:t>
+              <w:t>python scripts/39_export_algorithms.py --ids ALG-19</w:t>
             </w:r>
           </w:p>
         </w:tc>
@@ -8810,7 +9182,7 @@
               <w:rPr>
                 <w:sz w:val="14"/>
               </w:rPr>
-              <w:t>ALG-20</w:t>
+              <w:t>ALG-19</w:t>
             </w:r>
           </w:p>
         </w:tc>
@@ -8825,7 +9197,7 @@
               <w:rPr>
                 <w:sz w:val="14"/>
               </w:rPr>
-              <w:t>python scripts/40_export_equations.py</w:t>
+              <w:t>python scripts/39_export_algorithms.py --ids ALG-20</w:t>
             </w:r>
           </w:p>
         </w:tc>
@@ -8838,7 +9210,7 @@
               <w:rPr>
                 <w:sz w:val="14"/>
               </w:rPr>
-              <w:t>EQUATIONS-CSV, EQUATIONS-TEX, EQUATIONS-DOCX</w:t>
+              <w:t>ALG-20</w:t>
             </w:r>
           </w:p>
         </w:tc>
@@ -8853,7 +9225,7 @@
               <w:rPr>
                 <w:sz w:val="14"/>
               </w:rPr>
-              <w:t>python scripts/41_literature_review.py</w:t>
+              <w:t>python scripts/40_export_equations.py</w:t>
             </w:r>
           </w:p>
         </w:tc>
@@ -8866,7 +9238,7 @@
               <w:rPr>
                 <w:sz w:val="14"/>
               </w:rPr>
-              <w:t>LIT-01, LIT-02</w:t>
+              <w:t>EQUATIONS-CSV, EQUATIONS-TEX, EQUATIONS-DOCX</w:t>
             </w:r>
           </w:p>
         </w:tc>
@@ -8881,7 +9253,7 @@
               <w:rPr>
                 <w:sz w:val="14"/>
               </w:rPr>
-              <w:t>python scripts/43_q1_assets.py</w:t>
+              <w:t>python scripts/41_literature_review.py</w:t>
             </w:r>
           </w:p>
         </w:tc>
@@ -8894,7 +9266,7 @@
               <w:rPr>
                 <w:sz w:val="14"/>
               </w:rPr>
-              <w:t>Q1_T01, Q1_T02, Q1_T03, Q1_T04, Q1_T05, Q1_T06, Q1_T07, Q1_T08, Q1_T09, Q1_G01, Q1_G02, Q1_G03, Q1_G04, Q1_G05, Q1_F01, Q1_F02, Q1_ALG01, Q1_ALG02, Q1_ALG03, Q1_NARRATIVE</w:t>
+              <w:t>LIT-01, LIT-02</w:t>
             </w:r>
           </w:p>
         </w:tc>
@@ -8909,6 +9281,34 @@
               <w:rPr>
                 <w:sz w:val="14"/>
               </w:rPr>
+              <w:t>python scripts/43_q1_assets.py</w:t>
+            </w:r>
+          </w:p>
+        </w:tc>
+        <w:tc>
+          <w:tcPr>
+            <w:tcW w:type="dxa" w:w="4320"/>
+          </w:tcPr>
+          <w:p>
+            <w:r>
+              <w:rPr>
+                <w:sz w:val="14"/>
+              </w:rPr>
+              <w:t>Q1_T01, Q1_T02, Q1_T03, Q1_T04, Q1_T05, Q1_T06, Q1_T07, Q1_T08, Q1_T09, Q1_G01, Q1_G02, Q1_G03, Q1_G04, Q1_G05, Q1_F01, Q1_F02, Q1_ALG01, Q1_ALG02, Q1_ALG03, Q1_NARRATIVE</w:t>
+            </w:r>
+          </w:p>
+        </w:tc>
+      </w:tr>
+      <w:tr>
+        <w:tc>
+          <w:tcPr>
+            <w:tcW w:type="dxa" w:w="4320"/>
+          </w:tcPr>
+          <w:p>
+            <w:r>
+              <w:rPr>
+                <w:sz w:val="14"/>
+              </w:rPr>
               <w:t>python scripts/44_thesis_assets.py</w:t>
             </w:r>
           </w:p>
@@ -8923,6 +9323,174 @@
                 <w:sz w:val="14"/>
               </w:rPr>
               <w:t>THESIS-Ch1_Introduction, THESIS-Ch2_Literature, THESIS-Ch3_Methodology, THESIS-Ch4_Implementation, THESIS-Ch5_Results, THESIS-Ch6_Conclusion, THESIS-REPRODUCIBILITY</w:t>
+            </w:r>
+          </w:p>
+        </w:tc>
+      </w:tr>
+      <w:tr>
+        <w:tc>
+          <w:tcPr>
+            <w:tcW w:type="dxa" w:w="4320"/>
+          </w:tcPr>
+          <w:p>
+            <w:r>
+              <w:rPr>
+                <w:sz w:val="14"/>
+              </w:rPr>
+              <w:t>python scripts/46_finalize_task_models.py</w:t>
+            </w:r>
+          </w:p>
+        </w:tc>
+        <w:tc>
+          <w:tcPr>
+            <w:tcW w:type="dxa" w:w="4320"/>
+          </w:tcPr>
+          <w:p>
+            <w:r>
+              <w:rPr>
+                <w:sz w:val="14"/>
+              </w:rPr>
+              <w:t>MODEL-DEPLOY</w:t>
+            </w:r>
+          </w:p>
+        </w:tc>
+      </w:tr>
+      <w:tr>
+        <w:tc>
+          <w:tcPr>
+            <w:tcW w:type="dxa" w:w="4320"/>
+          </w:tcPr>
+          <w:p>
+            <w:r>
+              <w:rPr>
+                <w:sz w:val="14"/>
+              </w:rPr>
+              <w:t>python scripts/47_dashboard_screenshots.py</w:t>
+            </w:r>
+          </w:p>
+        </w:tc>
+        <w:tc>
+          <w:tcPr>
+            <w:tcW w:type="dxa" w:w="4320"/>
+          </w:tcPr>
+          <w:p>
+            <w:r>
+              <w:rPr>
+                <w:sz w:val="14"/>
+              </w:rPr>
+              <w:t>SS-01, SS-02, SS-03, SS-04, SS-05, SS-06, SS-07, SS-08, SS-09, SS-10, SS-11, SS-12, SS-13, SS-INDEX</w:t>
+            </w:r>
+          </w:p>
+        </w:tc>
+      </w:tr>
+      <w:tr>
+        <w:tc>
+          <w:tcPr>
+            <w:tcW w:type="dxa" w:w="4320"/>
+          </w:tcPr>
+          <w:p>
+            <w:r>
+              <w:rPr>
+                <w:sz w:val="14"/>
+              </w:rPr>
+              <w:t>python scripts/48_project_docs.py</w:t>
+            </w:r>
+          </w:p>
+        </w:tc>
+        <w:tc>
+          <w:tcPr>
+            <w:tcW w:type="dxa" w:w="4320"/>
+          </w:tcPr>
+          <w:p>
+            <w:r>
+              <w:rPr>
+                <w:sz w:val="14"/>
+              </w:rPr>
+              <w:t>DOC-ARCH, DOC-CONFIG</w:t>
+            </w:r>
+          </w:p>
+        </w:tc>
+      </w:tr>
+      <w:tr>
+        <w:tc>
+          <w:tcPr>
+            <w:tcW w:type="dxa" w:w="4320"/>
+          </w:tcPr>
+          <w:p>
+            <w:r>
+              <w:rPr>
+                <w:sz w:val="14"/>
+              </w:rPr>
+              <w:t>python scripts/49_final_qa_sweep.py</w:t>
+            </w:r>
+          </w:p>
+        </w:tc>
+        <w:tc>
+          <w:tcPr>
+            <w:tcW w:type="dxa" w:w="4320"/>
+          </w:tcPr>
+          <w:p>
+            <w:r>
+              <w:rPr>
+                <w:sz w:val="14"/>
+              </w:rPr>
+              <w:t>QA-SWEEP</w:t>
+            </w:r>
+          </w:p>
+        </w:tc>
+      </w:tr>
+      <w:tr>
+        <w:tc>
+          <w:tcPr>
+            <w:tcW w:type="dxa" w:w="4320"/>
+          </w:tcPr>
+          <w:p>
+            <w:r>
+              <w:rPr>
+                <w:sz w:val="14"/>
+              </w:rPr>
+              <w:t>python scripts/50_compliance_review.py</w:t>
+            </w:r>
+          </w:p>
+        </w:tc>
+        <w:tc>
+          <w:tcPr>
+            <w:tcW w:type="dxa" w:w="4320"/>
+          </w:tcPr>
+          <w:p>
+            <w:r>
+              <w:rPr>
+                <w:sz w:val="14"/>
+              </w:rPr>
+              <w:t>QA-COMPLIANCE</w:t>
+            </w:r>
+          </w:p>
+        </w:tc>
+      </w:tr>
+      <w:tr>
+        <w:tc>
+          <w:tcPr>
+            <w:tcW w:type="dxa" w:w="4320"/>
+          </w:tcPr>
+          <w:p>
+            <w:r>
+              <w:rPr>
+                <w:sz w:val="14"/>
+              </w:rPr>
+              <w:t>python scripts/51_package_delivery.py</w:t>
+            </w:r>
+          </w:p>
+        </w:tc>
+        <w:tc>
+          <w:tcPr>
+            <w:tcW w:type="dxa" w:w="4320"/>
+          </w:tcPr>
+          <w:p>
+            <w:r>
+              <w:rPr>
+                <w:sz w:val="14"/>
+              </w:rPr>
+              <w:t>DOC-HANDOVER</w:t>
             </w:r>
           </w:p>
         </w:tc>

</xml_diff>

<commit_message>
Phase 131: Analyse batch and compare -- batch mode with per-file progress, skip and cancel, sortable table with outcome counts, one batch id per batch in History, side-by-side compare view, refused files kept as rows, CSV written server-side from History
Co-Authored-By: Claude Opus 5 <noreply@anthropic.com>
</commit_message>
<xml_diff>
--- a/outputs/THESIS_ASSETS/Ch4_Implementation/reproducibility_appendix.docx
+++ b/outputs/THESIS_ASSETS/Ch4_Implementation/reproducibility_appendix.docx
@@ -218,7 +218,7 @@
               <w:rPr>
                 <w:sz w:val="14"/>
               </w:rPr>
-              <w:t>1ef602a52db1de7024b48d1a85be2f0c49f6d354</w:t>
+              <w:t>a860c1425f39ab3172c3f3304333845dfca77734</w:t>
             </w:r>
           </w:p>
         </w:tc>
@@ -246,7 +246,7 @@
               <w:rPr>
                 <w:sz w:val="14"/>
               </w:rPr>
-              <w:t>2026-09-13T17:10:24.652302+00:00</w:t>
+              <w:t>2026-09-14T10:25:40.779548+00:00</w:t>
             </w:r>
           </w:p>
         </w:tc>
@@ -262,7 +262,7 @@
     </w:p>
     <w:p>
       <w:r>
-        <w:t>Global seed: 42. Runs by recorded seed: 42 -&gt; 354. Runs recording a different seed: none.</w:t>
+        <w:t>Global seed: 42. Runs by recorded seed: 42 -&gt; 360. Runs recording a different seed: none.</w:t>
       </w:r>
     </w:p>
     <w:p>
@@ -1085,6 +1085,34 @@
                 <w:sz w:val="14"/>
               </w:rPr>
               <w:t>3.6.0</w:t>
+            </w:r>
+          </w:p>
+        </w:tc>
+      </w:tr>
+      <w:tr>
+        <w:tc>
+          <w:tcPr>
+            <w:tcW w:type="dxa" w:w="4320"/>
+          </w:tcPr>
+          <w:p>
+            <w:r>
+              <w:rPr>
+                <w:sz w:val="14"/>
+              </w:rPr>
+              <w:t>tinydb</w:t>
+            </w:r>
+          </w:p>
+        </w:tc>
+        <w:tc>
+          <w:tcPr>
+            <w:tcW w:type="dxa" w:w="4320"/>
+          </w:tcPr>
+          <w:p>
+            <w:r>
+              <w:rPr>
+                <w:sz w:val="14"/>
+              </w:rPr>
+              <w:t>4.9.0</w:t>
             </w:r>
           </w:p>
         </w:tc>
@@ -3715,20 +3743,20 @@
               <w:rPr>
                 <w:sz w:val="14"/>
               </w:rPr>
-              <w:t>94</w:t>
-            </w:r>
-          </w:p>
-        </w:tc>
-        <w:tc>
-          <w:tcPr>
-            <w:tcW w:type="dxa" w:w="1234"/>
-          </w:tcPr>
-          <w:p>
-            <w:r>
-              <w:rPr>
-                <w:sz w:val="14"/>
-              </w:rPr>
-              <w:t>88</w:t>
+              <w:t>97</w:t>
+            </w:r>
+          </w:p>
+        </w:tc>
+        <w:tc>
+          <w:tcPr>
+            <w:tcW w:type="dxa" w:w="1234"/>
+          </w:tcPr>
+          <w:p>
+            <w:r>
+              <w:rPr>
+                <w:sz w:val="14"/>
+              </w:rPr>
+              <w:t>91</w:t>
             </w:r>
           </w:p>
         </w:tc>
@@ -3754,20 +3782,20 @@
               <w:rPr>
                 <w:sz w:val="14"/>
               </w:rPr>
-              <w:t>1058.8</w:t>
-            </w:r>
-          </w:p>
-        </w:tc>
-        <w:tc>
-          <w:tcPr>
-            <w:tcW w:type="dxa" w:w="1234"/>
-          </w:tcPr>
-          <w:p>
-            <w:r>
-              <w:rPr>
-                <w:sz w:val="14"/>
-              </w:rPr>
-              <w:t>49.1</w:t>
+              <w:t>1214.6</w:t>
+            </w:r>
+          </w:p>
+        </w:tc>
+        <w:tc>
+          <w:tcPr>
+            <w:tcW w:type="dxa" w:w="1234"/>
+          </w:tcPr>
+          <w:p>
+            <w:r>
+              <w:rPr>
+                <w:sz w:val="14"/>
+              </w:rPr>
+              <w:t>82.4</w:t>
             </w:r>
           </w:p>
         </w:tc>
@@ -4273,20 +4301,20 @@
               <w:rPr>
                 <w:sz w:val="14"/>
               </w:rPr>
-              <w:t>55</w:t>
-            </w:r>
-          </w:p>
-        </w:tc>
-        <w:tc>
-          <w:tcPr>
-            <w:tcW w:type="dxa" w:w="1234"/>
-          </w:tcPr>
-          <w:p>
-            <w:r>
-              <w:rPr>
-                <w:sz w:val="14"/>
-              </w:rPr>
-              <w:t>40</w:t>
+              <w:t>57</w:t>
+            </w:r>
+          </w:p>
+        </w:tc>
+        <w:tc>
+          <w:tcPr>
+            <w:tcW w:type="dxa" w:w="1234"/>
+          </w:tcPr>
+          <w:p>
+            <w:r>
+              <w:rPr>
+                <w:sz w:val="14"/>
+              </w:rPr>
+              <w:t>42</w:t>
             </w:r>
           </w:p>
         </w:tc>
@@ -4312,7 +4340,7 @@
               <w:rPr>
                 <w:sz w:val="14"/>
               </w:rPr>
-              <w:t>270.0</w:t>
+              <w:t>280.6</w:t>
             </w:r>
           </w:p>
         </w:tc>
@@ -6319,20 +6347,20 @@
               <w:rPr>
                 <w:sz w:val="14"/>
               </w:rPr>
-              <w:t>5</w:t>
-            </w:r>
-          </w:p>
-        </w:tc>
-        <w:tc>
-          <w:tcPr>
-            <w:tcW w:type="dxa" w:w="1234"/>
-          </w:tcPr>
-          <w:p>
-            <w:r>
-              <w:rPr>
-                <w:sz w:val="14"/>
-              </w:rPr>
-              <w:t>5</w:t>
+              <w:t>6</w:t>
+            </w:r>
+          </w:p>
+        </w:tc>
+        <w:tc>
+          <w:tcPr>
+            <w:tcW w:type="dxa" w:w="1234"/>
+          </w:tcPr>
+          <w:p>
+            <w:r>
+              <w:rPr>
+                <w:sz w:val="14"/>
+              </w:rPr>
+              <w:t>6</w:t>
             </w:r>
           </w:p>
         </w:tc>
@@ -6358,7 +6386,7 @@
               <w:rPr>
                 <w:sz w:val="14"/>
               </w:rPr>
-              <w:t>29.7</w:t>
+              <w:t>35.9</w:t>
             </w:r>
           </w:p>
         </w:tc>

</xml_diff>

<commit_message>
Phase 132: History page -- server-filtered list with search, result/task/tag/date filters kept in the address, record drawer with waveform for sample entries and notes/tags editing, delete with undo (restore route) and delete-all with confirmation, compare two records, fresh-install empty state
Co-Authored-By: Claude Opus 5 <noreply@anthropic.com>
</commit_message>
<xml_diff>
--- a/outputs/THESIS_ASSETS/Ch4_Implementation/reproducibility_appendix.docx
+++ b/outputs/THESIS_ASSETS/Ch4_Implementation/reproducibility_appendix.docx
@@ -218,7 +218,7 @@
               <w:rPr>
                 <w:sz w:val="14"/>
               </w:rPr>
-              <w:t>a860c1425f39ab3172c3f3304333845dfca77734</w:t>
+              <w:t>6d9561568e4768aad014800aca49534abf4499b0</w:t>
             </w:r>
           </w:p>
         </w:tc>
@@ -246,7 +246,7 @@
               <w:rPr>
                 <w:sz w:val="14"/>
               </w:rPr>
-              <w:t>2026-09-14T10:25:40.779548+00:00</w:t>
+              <w:t>2026-09-14T11:44:11.847427+00:00</w:t>
             </w:r>
           </w:p>
         </w:tc>
@@ -262,7 +262,7 @@
     </w:p>
     <w:p>
       <w:r>
-        <w:t>Global seed: 42. Runs by recorded seed: 42 -&gt; 360. Runs recording a different seed: none.</w:t>
+        <w:t>Global seed: 42. Runs by recorded seed: 42 -&gt; 363. Runs recording a different seed: none.</w:t>
       </w:r>
     </w:p>
     <w:p>
@@ -3743,20 +3743,20 @@
               <w:rPr>
                 <w:sz w:val="14"/>
               </w:rPr>
-              <w:t>97</w:t>
-            </w:r>
-          </w:p>
-        </w:tc>
-        <w:tc>
-          <w:tcPr>
-            <w:tcW w:type="dxa" w:w="1234"/>
-          </w:tcPr>
-          <w:p>
-            <w:r>
-              <w:rPr>
-                <w:sz w:val="14"/>
-              </w:rPr>
-              <w:t>91</w:t>
+              <w:t>98</w:t>
+            </w:r>
+          </w:p>
+        </w:tc>
+        <w:tc>
+          <w:tcPr>
+            <w:tcW w:type="dxa" w:w="1234"/>
+          </w:tcPr>
+          <w:p>
+            <w:r>
+              <w:rPr>
+                <w:sz w:val="14"/>
+              </w:rPr>
+              <w:t>92</w:t>
             </w:r>
           </w:p>
         </w:tc>
@@ -3782,7 +3782,7 @@
               <w:rPr>
                 <w:sz w:val="14"/>
               </w:rPr>
-              <w:t>1214.6</w:t>
+              <w:t>1236.9</w:t>
             </w:r>
           </w:p>
         </w:tc>
@@ -4301,20 +4301,20 @@
               <w:rPr>
                 <w:sz w:val="14"/>
               </w:rPr>
-              <w:t>57</w:t>
-            </w:r>
-          </w:p>
-        </w:tc>
-        <w:tc>
-          <w:tcPr>
-            <w:tcW w:type="dxa" w:w="1234"/>
-          </w:tcPr>
-          <w:p>
-            <w:r>
-              <w:rPr>
-                <w:sz w:val="14"/>
-              </w:rPr>
-              <w:t>42</w:t>
+              <w:t>58</w:t>
+            </w:r>
+          </w:p>
+        </w:tc>
+        <w:tc>
+          <w:tcPr>
+            <w:tcW w:type="dxa" w:w="1234"/>
+          </w:tcPr>
+          <w:p>
+            <w:r>
+              <w:rPr>
+                <w:sz w:val="14"/>
+              </w:rPr>
+              <w:t>43</w:t>
             </w:r>
           </w:p>
         </w:tc>
@@ -4340,7 +4340,7 @@
               <w:rPr>
                 <w:sz w:val="14"/>
               </w:rPr>
-              <w:t>280.6</w:t>
+              <w:t>296.8</w:t>
             </w:r>
           </w:p>
         </w:tc>
@@ -6347,20 +6347,20 @@
               <w:rPr>
                 <w:sz w:val="14"/>
               </w:rPr>
-              <w:t>6</w:t>
-            </w:r>
-          </w:p>
-        </w:tc>
-        <w:tc>
-          <w:tcPr>
-            <w:tcW w:type="dxa" w:w="1234"/>
-          </w:tcPr>
-          <w:p>
-            <w:r>
-              <w:rPr>
-                <w:sz w:val="14"/>
-              </w:rPr>
-              <w:t>6</w:t>
+              <w:t>7</w:t>
+            </w:r>
+          </w:p>
+        </w:tc>
+        <w:tc>
+          <w:tcPr>
+            <w:tcW w:type="dxa" w:w="1234"/>
+          </w:tcPr>
+          <w:p>
+            <w:r>
+              <w:rPr>
+                <w:sz w:val="14"/>
+              </w:rPr>
+              <w:t>7</w:t>
             </w:r>
           </w:p>
         </w:tc>
@@ -6386,20 +6386,20 @@
               <w:rPr>
                 <w:sz w:val="14"/>
               </w:rPr>
-              <w:t>35.9</w:t>
-            </w:r>
-          </w:p>
-        </w:tc>
-        <w:tc>
-          <w:tcPr>
-            <w:tcW w:type="dxa" w:w="1234"/>
-          </w:tcPr>
-          <w:p>
-            <w:r>
-              <w:rPr>
-                <w:sz w:val="14"/>
-              </w:rPr>
-              <w:t>6.4</w:t>
+              <w:t>67.9</w:t>
+            </w:r>
+          </w:p>
+        </w:tc>
+        <w:tc>
+          <w:tcPr>
+            <w:tcW w:type="dxa" w:w="1234"/>
+          </w:tcPr>
+          <w:p>
+            <w:r>
+              <w:rPr>
+                <w:sz w:val="14"/>
+              </w:rPr>
+              <w:t>32.0</w:t>
             </w:r>
           </w:p>
         </w:tc>

</xml_diff>